<commit_message>
Upgrade: Add bilingual Architecture & Strategy tab, interactive system diagram, and clean Oday developer comment
</commit_message>
<xml_diff>
--- a/العرض المالي المحدث122.docx
+++ b/العرض المالي المحدث122.docx
@@ -1,6 +1,6 @@
 
 <file path=word/document.xml><?xml version="1.0" encoding="utf-8"?>
-<w:document xmlns:wpc="http://schemas.microsoft.com/office/word/2010/wordprocessingCanvas" xmlns:cx="http://schemas.microsoft.com/office/drawing/2014/chartex" xmlns:cx1="http://schemas.microsoft.com/office/drawing/2015/9/8/chartex" xmlns:cx2="http://schemas.microsoft.com/office/drawing/2015/10/21/chartex" xmlns:cx3="http://schemas.microsoft.com/office/drawing/2016/5/9/chartex" xmlns:cx4="http://schemas.microsoft.com/office/drawing/2016/5/10/chartex" xmlns:cx5="http://schemas.microsoft.com/office/drawing/2016/5/11/chartex" xmlns:cx6="http://schemas.microsoft.com/office/drawing/2016/5/12/chartex" xmlns:cx7="http://schemas.microsoft.com/office/drawing/2016/5/13/chartex" xmlns:cx8="http://schemas.microsoft.com/office/drawing/2016/5/14/chartex" xmlns:mc="http://schemas.openxmlformats.org/markup-compatibility/2006" xmlns:aink="http://schemas.microsoft.com/office/drawing/2016/ink" xmlns:am3d="http://schemas.microsoft.com/office/drawing/2017/model3d" xmlns:o="urn:schemas-microsoft-com:office:office" xmlns:oel="http://schemas.microsoft.com/office/2019/extlst" xmlns:r="http://schemas.openxmlformats.org/officeDocument/2006/relationships" xmlns:m="http://schemas.openxmlformats.org/officeDocument/2006/math" xmlns:v="urn:schemas-microsoft-com:vml" xmlns:wp14="http://schemas.microsoft.com/office/word/2010/wordprocessingDrawing" xmlns:wp="http://schemas.openxmlformats.org/drawingml/2006/wordprocessingDrawing" xmlns:w10="urn:schemas-microsoft-com:office:word" xmlns:w="http://schemas.openxmlformats.org/wordprocessingml/2006/main" xmlns:w14="http://schemas.microsoft.com/office/word/2010/wordml" xmlns:w15="http://schemas.microsoft.com/office/word/2012/wordml" xmlns:w16cex="http://schemas.microsoft.com/office/word/2018/wordml/cex" xmlns:w16cid="http://schemas.microsoft.com/office/word/2016/wordml/cid" xmlns:w16="http://schemas.microsoft.com/office/word/2018/wordml" xmlns:w16sdtdh="http://schemas.microsoft.com/office/word/2020/wordml/sdtdatahash" xmlns:w16se="http://schemas.microsoft.com/office/word/2015/wordml/symex" xmlns:wpg="http://schemas.microsoft.com/office/word/2010/wordprocessingGroup" xmlns:wpi="http://schemas.microsoft.com/office/word/2010/wordprocessingInk" xmlns:wne="http://schemas.microsoft.com/office/word/2006/wordml" xmlns:wps="http://schemas.microsoft.com/office/word/2010/wordprocessingShape" mc:Ignorable="w14 w15 w16se w16cid w16 w16cex w16sdtdh wp14">
+<w:document xmlns:wpc="http://schemas.microsoft.com/office/word/2010/wordprocessingCanvas" xmlns:cx="http://schemas.microsoft.com/office/drawing/2014/chartex" xmlns:cx1="http://schemas.microsoft.com/office/drawing/2015/9/8/chartex" xmlns:cx2="http://schemas.microsoft.com/office/drawing/2015/10/21/chartex" xmlns:cx3="http://schemas.microsoft.com/office/drawing/2016/5/9/chartex" xmlns:cx4="http://schemas.microsoft.com/office/drawing/2016/5/10/chartex" xmlns:cx5="http://schemas.microsoft.com/office/drawing/2016/5/11/chartex" xmlns:cx6="http://schemas.microsoft.com/office/drawing/2016/5/12/chartex" xmlns:cx7="http://schemas.microsoft.com/office/drawing/2016/5/13/chartex" xmlns:cx8="http://schemas.microsoft.com/office/drawing/2016/5/14/chartex" xmlns:mc="http://schemas.openxmlformats.org/markup-compatibility/2006" xmlns:aink="http://schemas.microsoft.com/office/drawing/2016/ink" xmlns:am3d="http://schemas.microsoft.com/office/drawing/2017/model3d" xmlns:o="urn:schemas-microsoft-com:office:office" xmlns:oel="http://schemas.microsoft.com/office/2019/extlst" xmlns:r="http://schemas.openxmlformats.org/officeDocument/2006/relationships" xmlns:m="http://schemas.openxmlformats.org/officeDocument/2006/math" xmlns:v="urn:schemas-microsoft-com:vml" xmlns:wp14="http://schemas.microsoft.com/office/word/2010/wordprocessingDrawing" xmlns:wp="http://schemas.openxmlformats.org/drawingml/2006/wordprocessingDrawing" xmlns:w10="urn:schemas-microsoft-com:office:word" xmlns:w="http://schemas.openxmlformats.org/wordprocessingml/2006/main" xmlns:w14="http://schemas.microsoft.com/office/word/2010/wordml" xmlns:w15="http://schemas.microsoft.com/office/word/2012/wordml" xmlns:w16cex="http://schemas.microsoft.com/office/word/2018/wordml/cex" xmlns:w16cid="http://schemas.microsoft.com/office/word/2016/wordml/cid" xmlns:w16="http://schemas.microsoft.com/office/word/2018/wordml" xmlns:w16du="http://schemas.microsoft.com/office/word/2023/wordml/word16du" xmlns:w16sdtdh="http://schemas.microsoft.com/office/word/2020/wordml/sdtdatahash" xmlns:w16sdtfl="http://schemas.microsoft.com/office/word/2024/wordml/sdtformatlock" xmlns:w16se="http://schemas.microsoft.com/office/word/2015/wordml/symex" xmlns:wpg="http://schemas.microsoft.com/office/word/2010/wordprocessingGroup" xmlns:wpi="http://schemas.microsoft.com/office/word/2010/wordprocessingInk" xmlns:wne="http://schemas.microsoft.com/office/word/2006/wordml" xmlns:wps="http://schemas.microsoft.com/office/word/2010/wordprocessingShape" mc:Ignorable="w14 w15 w16se w16cid w16 w16cex w16sdtdh w16sdtfl w16du wp14">
   <w:body>
     <w:p>
       <w:pPr>
@@ -930,7 +930,7 @@
     </w:p>
     <w:p>
       <w:pPr>
-        <w:pStyle w:val="a6"/>
+        <w:pStyle w:val="ListParagraph"/>
         <w:numPr>
           <w:ilvl w:val="0"/>
           <w:numId w:val="22"/>
@@ -1095,7 +1095,7 @@
     </w:p>
     <w:tbl>
       <w:tblPr>
-        <w:tblStyle w:val="ac"/>
+        <w:tblStyle w:val="TableGrid"/>
         <w:bidiVisual/>
         <w:tblW w:w="0" w:type="auto"/>
         <w:tblInd w:w="-238" w:type="dxa"/>
@@ -1645,7 +1645,7 @@
               <w:spacing w:line="192" w:lineRule="auto"/>
               <w:jc w:val="center"/>
               <w:rPr>
-                <w:rFonts w:ascii="Simplified Arabic" w:hAnsi="Simplified Arabic" w:cs="Simplified Arabic" w:hint="cs"/>
+                <w:rFonts w:ascii="Simplified Arabic" w:hAnsi="Simplified Arabic" w:cs="Simplified Arabic"/>
                 <w:b/>
                 <w:bCs/>
                 <w:rtl/>
@@ -1722,7 +1722,7 @@
               <w:spacing w:line="192" w:lineRule="auto"/>
               <w:jc w:val="center"/>
               <w:rPr>
-                <w:rFonts w:ascii="Simplified Arabic" w:hAnsi="Simplified Arabic" w:cs="Simplified Arabic" w:hint="cs"/>
+                <w:rFonts w:ascii="Simplified Arabic" w:hAnsi="Simplified Arabic" w:cs="Simplified Arabic"/>
                 <w:b/>
                 <w:bCs/>
                 <w:rtl/>
@@ -1799,7 +1799,7 @@
               <w:spacing w:line="192" w:lineRule="auto"/>
               <w:jc w:val="center"/>
               <w:rPr>
-                <w:rFonts w:ascii="Simplified Arabic" w:hAnsi="Simplified Arabic" w:cs="Simplified Arabic" w:hint="cs"/>
+                <w:rFonts w:ascii="Simplified Arabic" w:hAnsi="Simplified Arabic" w:cs="Simplified Arabic"/>
                 <w:b/>
                 <w:bCs/>
                 <w:rtl/>
@@ -1876,7 +1876,7 @@
               <w:spacing w:line="192" w:lineRule="auto"/>
               <w:jc w:val="center"/>
               <w:rPr>
-                <w:rFonts w:ascii="Simplified Arabic" w:hAnsi="Simplified Arabic" w:cs="Simplified Arabic" w:hint="cs"/>
+                <w:rFonts w:ascii="Simplified Arabic" w:hAnsi="Simplified Arabic" w:cs="Simplified Arabic"/>
                 <w:b/>
                 <w:bCs/>
                 <w:rtl/>
@@ -1953,7 +1953,7 @@
               <w:spacing w:line="192" w:lineRule="auto"/>
               <w:jc w:val="center"/>
               <w:rPr>
-                <w:rFonts w:ascii="Simplified Arabic" w:hAnsi="Simplified Arabic" w:cs="Simplified Arabic" w:hint="cs"/>
+                <w:rFonts w:ascii="Simplified Arabic" w:hAnsi="Simplified Arabic" w:cs="Simplified Arabic"/>
                 <w:b/>
                 <w:bCs/>
                 <w:rtl/>
@@ -2030,7 +2030,7 @@
               <w:spacing w:line="192" w:lineRule="auto"/>
               <w:jc w:val="center"/>
               <w:rPr>
-                <w:rFonts w:ascii="Simplified Arabic" w:hAnsi="Simplified Arabic" w:cs="Simplified Arabic" w:hint="cs"/>
+                <w:rFonts w:ascii="Simplified Arabic" w:hAnsi="Simplified Arabic" w:cs="Simplified Arabic"/>
                 <w:b/>
                 <w:bCs/>
                 <w:rtl/>
@@ -2107,7 +2107,7 @@
               <w:spacing w:line="192" w:lineRule="auto"/>
               <w:jc w:val="center"/>
               <w:rPr>
-                <w:rFonts w:ascii="Simplified Arabic" w:hAnsi="Simplified Arabic" w:cs="Simplified Arabic" w:hint="cs"/>
+                <w:rFonts w:ascii="Simplified Arabic" w:hAnsi="Simplified Arabic" w:cs="Simplified Arabic"/>
                 <w:b/>
                 <w:bCs/>
                 <w:rtl/>
@@ -3478,25 +3478,19 @@
           <w:tcPr>
             <w:tcW w:w="568" w:type="dxa"/>
           </w:tcPr>
-          <w:p>
-            <w:r/>
-          </w:p>
+          <w:p/>
         </w:tc>
         <w:tc>
           <w:tcPr>
             <w:tcW w:w="709" w:type="dxa"/>
           </w:tcPr>
-          <w:p>
-            <w:r/>
-          </w:p>
+          <w:p/>
         </w:tc>
         <w:tc>
           <w:tcPr>
             <w:tcW w:w="1151" w:type="dxa"/>
           </w:tcPr>
-          <w:p>
-            <w:r/>
-          </w:p>
+          <w:p/>
         </w:tc>
         <w:tc>
           <w:tcPr>
@@ -3525,7 +3519,7 @@
     </w:p>
     <w:p>
       <w:pPr>
-        <w:pStyle w:val="a6"/>
+        <w:pStyle w:val="ListParagraph"/>
         <w:numPr>
           <w:ilvl w:val="0"/>
           <w:numId w:val="22"/>
@@ -3628,7 +3622,7 @@
     </w:p>
     <w:p>
       <w:pPr>
-        <w:pStyle w:val="a6"/>
+        <w:pStyle w:val="ListParagraph"/>
         <w:numPr>
           <w:ilvl w:val="0"/>
           <w:numId w:val="22"/>
@@ -3695,7 +3689,7 @@
     </w:p>
     <w:p>
       <w:pPr>
-        <w:pStyle w:val="a6"/>
+        <w:pStyle w:val="ListParagraph"/>
         <w:numPr>
           <w:ilvl w:val="0"/>
           <w:numId w:val="16"/>
@@ -3935,7 +3929,7 @@
     </w:p>
     <w:p>
       <w:pPr>
-        <w:pStyle w:val="a6"/>
+        <w:pStyle w:val="ListParagraph"/>
         <w:numPr>
           <w:ilvl w:val="0"/>
           <w:numId w:val="16"/>
@@ -4215,7 +4209,7 @@
     </w:p>
     <w:p>
       <w:pPr>
-        <w:pStyle w:val="a6"/>
+        <w:pStyle w:val="ListParagraph"/>
         <w:numPr>
           <w:ilvl w:val="0"/>
           <w:numId w:val="16"/>
@@ -4530,6 +4524,364 @@
           <w:bCs/>
           <w:sz w:val="28"/>
           <w:szCs w:val="28"/>
+          <w:lang w:bidi="ar-YE"/>
+        </w:rPr>
+      </w:pPr>
+      <w:r>
+        <w:rPr>
+          <w:rFonts w:ascii="Simplified Arabic" w:hAnsi="Simplified Arabic" w:cs="Simplified Arabic"/>
+          <w:b/>
+          <w:bCs/>
+          <w:sz w:val="28"/>
+          <w:szCs w:val="28"/>
+          <w:lang w:bidi="ar-YE"/>
+        </w:rPr>
+        <w:lastRenderedPageBreak/>
+        <w:t xml:space="preserve">CTO/Amjad Sinan Al-Sharabi: </w:t>
+      </w:r>
+    </w:p>
+    <w:p>
+      <w:pPr>
+        <w:spacing w:after="0" w:line="276" w:lineRule="auto"/>
+        <w:jc w:val="both"/>
+        <w:rPr>
+          <w:rFonts w:ascii="Simplified Arabic" w:hAnsi="Simplified Arabic" w:cs="Simplified Arabic"/>
+          <w:b/>
+          <w:bCs/>
+          <w:sz w:val="28"/>
+          <w:szCs w:val="28"/>
+          <w:lang w:bidi="ar-YE"/>
+        </w:rPr>
+      </w:pPr>
+      <w:r>
+        <w:rPr>
+          <w:rFonts w:ascii="Simplified Arabic" w:hAnsi="Simplified Arabic" w:cs="Simplified Arabic"/>
+          <w:b/>
+          <w:bCs/>
+          <w:sz w:val="28"/>
+          <w:szCs w:val="28"/>
+          <w:rtl/>
+        </w:rPr>
+        <w:t>أحب أوضح</w:t>
+      </w:r>
+      <w:r>
+        <w:rPr>
+          <w:rFonts w:ascii="Simplified Arabic" w:hAnsi="Simplified Arabic" w:cs="Simplified Arabic"/>
+          <w:b/>
+          <w:bCs/>
+          <w:sz w:val="28"/>
+          <w:szCs w:val="28"/>
+        </w:rPr>
+        <w:t xml:space="preserve"> </w:t>
+      </w:r>
+      <w:r>
+        <w:rPr>
+          <w:rFonts w:ascii="Simplified Arabic" w:hAnsi="Simplified Arabic" w:cs="Simplified Arabic" w:hint="cs"/>
+          <w:b/>
+          <w:bCs/>
+          <w:sz w:val="28"/>
+          <w:szCs w:val="28"/>
+          <w:rtl/>
+        </w:rPr>
+        <w:t>بكل شفافيى</w:t>
+      </w:r>
+      <w:r>
+        <w:rPr>
+          <w:rFonts w:ascii="Simplified Arabic" w:hAnsi="Simplified Arabic" w:cs="Simplified Arabic"/>
+          <w:b/>
+          <w:bCs/>
+          <w:sz w:val="28"/>
+          <w:szCs w:val="28"/>
+          <w:rtl/>
+        </w:rPr>
+        <w:t xml:space="preserve"> أن هذا العرض المالي تم بناؤه بشكل عملي وبسيط يعكس طبيعة الشغل الفعلي على المشروع، وليس مجرد تسعير نظري. تم حساب الجهد بناءً على تقسيم حقيقي لمراحل التطوير، بحيث كل مرحلة تمثل جزء واضح من بناء النظام وليس عمل عشوائي أو غير محدد</w:t>
+      </w:r>
+      <w:r>
+        <w:rPr>
+          <w:rFonts w:ascii="Simplified Arabic" w:hAnsi="Simplified Arabic" w:cs="Simplified Arabic"/>
+          <w:b/>
+          <w:bCs/>
+          <w:sz w:val="28"/>
+          <w:szCs w:val="28"/>
+          <w:lang w:bidi="ar-YE"/>
+        </w:rPr>
+        <w:t>.</w:t>
+      </w:r>
+    </w:p>
+    <w:p>
+      <w:pPr>
+        <w:spacing w:after="0" w:line="276" w:lineRule="auto"/>
+        <w:jc w:val="both"/>
+        <w:rPr>
+          <w:rFonts w:ascii="Simplified Arabic" w:hAnsi="Simplified Arabic" w:cs="Simplified Arabic"/>
+          <w:b/>
+          <w:bCs/>
+          <w:sz w:val="28"/>
+          <w:szCs w:val="28"/>
+          <w:lang w:bidi="ar-YE"/>
+        </w:rPr>
+      </w:pPr>
+      <w:r>
+        <w:rPr>
+          <w:rFonts w:ascii="Simplified Arabic" w:hAnsi="Simplified Arabic" w:cs="Simplified Arabic"/>
+          <w:b/>
+          <w:bCs/>
+          <w:sz w:val="28"/>
+          <w:szCs w:val="28"/>
+          <w:rtl/>
+        </w:rPr>
+        <w:t>الهدف من توزيع المهام بهذا الشكل هو ضمان أن كل جزء من النظام يتم تطويره بشكل مستقل وقابل للاختبار والمراجعة، بدءًا من تحليل المتطلبات وفهم احتياج النظام، ثم الانتقال إلى تصميم الواجهة وتجربة المستخدم، وبعدها بناء قاعدة البيانات وهيكلة النظام بشكل صحيح، ثم تطوير المكونات الأساسية مثل إدارة الجهات الفاعلة، الخرائط التفاعلية، وشبكة العلاقات</w:t>
+      </w:r>
+      <w:r>
+        <w:rPr>
+          <w:rFonts w:ascii="Simplified Arabic" w:hAnsi="Simplified Arabic" w:cs="Simplified Arabic"/>
+          <w:b/>
+          <w:bCs/>
+          <w:sz w:val="28"/>
+          <w:szCs w:val="28"/>
+          <w:lang w:bidi="ar-YE"/>
+        </w:rPr>
+        <w:t>.</w:t>
+      </w:r>
+    </w:p>
+    <w:p>
+      <w:pPr>
+        <w:spacing w:after="0" w:line="276" w:lineRule="auto"/>
+        <w:jc w:val="both"/>
+        <w:rPr>
+          <w:rFonts w:ascii="Simplified Arabic" w:hAnsi="Simplified Arabic" w:cs="Simplified Arabic"/>
+          <w:b/>
+          <w:bCs/>
+          <w:sz w:val="28"/>
+          <w:szCs w:val="28"/>
+          <w:lang w:bidi="ar-YE"/>
+        </w:rPr>
+      </w:pPr>
+      <w:r>
+        <w:rPr>
+          <w:rFonts w:ascii="Simplified Arabic" w:hAnsi="Simplified Arabic" w:cs="Simplified Arabic"/>
+          <w:b/>
+          <w:bCs/>
+          <w:sz w:val="28"/>
+          <w:szCs w:val="28"/>
+          <w:rtl/>
+        </w:rPr>
+        <w:t>تم إدخال التكامل مع أدوات جمع البيانات مثل</w:t>
+      </w:r>
+      <w:r>
+        <w:rPr>
+          <w:rFonts w:ascii="Simplified Arabic" w:hAnsi="Simplified Arabic" w:cs="Simplified Arabic"/>
+          <w:b/>
+          <w:bCs/>
+          <w:sz w:val="28"/>
+          <w:szCs w:val="28"/>
+          <w:lang w:bidi="ar-YE"/>
+        </w:rPr>
+        <w:t xml:space="preserve"> Kobo Toolbox API </w:t>
+      </w:r>
+      <w:r>
+        <w:rPr>
+          <w:rFonts w:ascii="Simplified Arabic" w:hAnsi="Simplified Arabic" w:cs="Simplified Arabic"/>
+          <w:b/>
+          <w:bCs/>
+          <w:sz w:val="28"/>
+          <w:szCs w:val="28"/>
+          <w:rtl/>
+        </w:rPr>
+        <w:t>بشكل مبكر في الخطة لأنه يعتبر جزء أساسي من تدفق البيانات داخل النظام، وليس مجرد إضافة لاحقة، وبالتالي تم تخصيص وقت له ضمن التطوير وليس كملحق منفصل</w:t>
+      </w:r>
+      <w:r>
+        <w:rPr>
+          <w:rFonts w:ascii="Simplified Arabic" w:hAnsi="Simplified Arabic" w:cs="Simplified Arabic"/>
+          <w:b/>
+          <w:bCs/>
+          <w:sz w:val="28"/>
+          <w:szCs w:val="28"/>
+          <w:lang w:bidi="ar-YE"/>
+        </w:rPr>
+        <w:t>.</w:t>
+      </w:r>
+    </w:p>
+    <w:p>
+      <w:pPr>
+        <w:spacing w:after="0" w:line="276" w:lineRule="auto"/>
+        <w:jc w:val="both"/>
+        <w:rPr>
+          <w:rFonts w:ascii="Simplified Arabic" w:hAnsi="Simplified Arabic" w:cs="Simplified Arabic"/>
+          <w:b/>
+          <w:bCs/>
+          <w:sz w:val="28"/>
+          <w:szCs w:val="28"/>
+          <w:lang w:bidi="ar-YE"/>
+        </w:rPr>
+      </w:pPr>
+      <w:r>
+        <w:rPr>
+          <w:rFonts w:ascii="Simplified Arabic" w:hAnsi="Simplified Arabic" w:cs="Simplified Arabic"/>
+          <w:b/>
+          <w:bCs/>
+          <w:sz w:val="28"/>
+          <w:szCs w:val="28"/>
+          <w:rtl/>
+        </w:rPr>
+        <w:t>كما تم تخصيص وقت لمراجعة النسخة التجريبية مع الجهة المستفيدة، لأن طبيعة هذا النوع من المشاريع تعتمد بشكل كبير على التغذية الراجعة والتعديل أثناء التنفيذ، وليس على بناء نهائي مغلق من البداية</w:t>
+      </w:r>
+      <w:r>
+        <w:rPr>
+          <w:rFonts w:ascii="Simplified Arabic" w:hAnsi="Simplified Arabic" w:cs="Simplified Arabic"/>
+          <w:b/>
+          <w:bCs/>
+          <w:sz w:val="28"/>
+          <w:szCs w:val="28"/>
+          <w:lang w:bidi="ar-YE"/>
+        </w:rPr>
+        <w:t>.</w:t>
+      </w:r>
+    </w:p>
+    <w:p>
+      <w:pPr>
+        <w:spacing w:after="0" w:line="276" w:lineRule="auto"/>
+        <w:jc w:val="both"/>
+        <w:rPr>
+          <w:rFonts w:ascii="Simplified Arabic" w:hAnsi="Simplified Arabic" w:cs="Simplified Arabic"/>
+          <w:b/>
+          <w:bCs/>
+          <w:sz w:val="28"/>
+          <w:szCs w:val="28"/>
+          <w:lang w:bidi="ar-YE"/>
+        </w:rPr>
+      </w:pPr>
+      <w:r>
+        <w:rPr>
+          <w:rFonts w:ascii="Simplified Arabic" w:hAnsi="Simplified Arabic" w:cs="Simplified Arabic"/>
+          <w:b/>
+          <w:bCs/>
+          <w:sz w:val="28"/>
+          <w:szCs w:val="28"/>
+          <w:rtl/>
+        </w:rPr>
+        <w:t>في المراحل الأخيرة تم إدخال جانب التشغيل الفعلي للنظام، مثل التدريب العملي للفريق، وإعداد دليل استخدام بسيط ثنائي اللغة، وتسليم المشروع بشكل كامل مع الملفات المصدرية ووثائق التشغيل، لأن الهدف الأساسي ليس فقط تسليم منصة، بل ضمان قدرة الفريق على استخدامها وتشغيلها بعد انتهاء المشروع بدون اعتماد كامل على المطور</w:t>
+      </w:r>
+      <w:r>
+        <w:rPr>
+          <w:rFonts w:ascii="Simplified Arabic" w:hAnsi="Simplified Arabic" w:cs="Simplified Arabic" w:hint="cs"/>
+          <w:b/>
+          <w:bCs/>
+          <w:sz w:val="28"/>
+          <w:szCs w:val="28"/>
+          <w:rtl/>
+        </w:rPr>
+        <w:t xml:space="preserve"> نحن!</w:t>
+      </w:r>
+      <w:r>
+        <w:rPr>
+          <w:rFonts w:ascii="Simplified Arabic" w:hAnsi="Simplified Arabic" w:cs="Simplified Arabic"/>
+          <w:b/>
+          <w:bCs/>
+          <w:sz w:val="28"/>
+          <w:szCs w:val="28"/>
+          <w:lang w:bidi="ar-YE"/>
+        </w:rPr>
+        <w:t>.</w:t>
+      </w:r>
+    </w:p>
+    <w:p>
+      <w:pPr>
+        <w:spacing w:after="0" w:line="276" w:lineRule="auto"/>
+        <w:jc w:val="both"/>
+        <w:rPr>
+          <w:rFonts w:ascii="Simplified Arabic" w:hAnsi="Simplified Arabic" w:cs="Simplified Arabic"/>
+          <w:b/>
+          <w:bCs/>
+          <w:sz w:val="28"/>
+          <w:szCs w:val="28"/>
+          <w:lang w:bidi="ar-YE"/>
+        </w:rPr>
+      </w:pPr>
+      <w:r>
+        <w:rPr>
+          <w:rFonts w:ascii="Simplified Arabic" w:hAnsi="Simplified Arabic" w:cs="Simplified Arabic"/>
+          <w:b/>
+          <w:bCs/>
+          <w:sz w:val="28"/>
+          <w:szCs w:val="28"/>
+          <w:rtl/>
+        </w:rPr>
+        <w:t>تم اعتماد نموذج الدفع المرحلي لأنه يربط كل دفعة بإنجاز فعلي واضح على الأرض، بحيث لا يتم دفع أي مبلغ إلا مقابل مخرجات ملموسة يمكن التحقق منها مثل نسخة تجريبية أو النسخة النهائية أو التسليم الكامل للنظام</w:t>
+      </w:r>
+      <w:r>
+        <w:rPr>
+          <w:rFonts w:ascii="Simplified Arabic" w:hAnsi="Simplified Arabic" w:cs="Simplified Arabic"/>
+          <w:b/>
+          <w:bCs/>
+          <w:sz w:val="28"/>
+          <w:szCs w:val="28"/>
+          <w:lang w:bidi="ar-YE"/>
+        </w:rPr>
+        <w:t>.</w:t>
+      </w:r>
+    </w:p>
+    <w:p>
+      <w:pPr>
+        <w:spacing w:after="0" w:line="276" w:lineRule="auto"/>
+        <w:jc w:val="both"/>
+        <w:rPr>
+          <w:rFonts w:ascii="Simplified Arabic" w:hAnsi="Simplified Arabic" w:cs="Simplified Arabic"/>
+          <w:b/>
+          <w:bCs/>
+          <w:sz w:val="28"/>
+          <w:szCs w:val="28"/>
+          <w:lang w:bidi="ar-YE"/>
+        </w:rPr>
+      </w:pPr>
+      <w:r>
+        <w:rPr>
+          <w:rFonts w:ascii="Simplified Arabic" w:hAnsi="Simplified Arabic" w:cs="Simplified Arabic"/>
+          <w:b/>
+          <w:bCs/>
+          <w:sz w:val="28"/>
+          <w:szCs w:val="28"/>
+          <w:rtl/>
+        </w:rPr>
+        <w:t>وأخيرًا، مدة صلاحية العرض (60 يوم) تم تحديدها فقط لضمان أن يكون هناك وقت كافي للمراجعة والتفاوض والتحديث في حال تغيرت بعض متطلبات المشروع قبل التوقيع النهائي</w:t>
+      </w:r>
+      <w:r>
+        <w:rPr>
+          <w:rFonts w:ascii="Simplified Arabic" w:hAnsi="Simplified Arabic" w:cs="Simplified Arabic"/>
+          <w:b/>
+          <w:bCs/>
+          <w:sz w:val="28"/>
+          <w:szCs w:val="28"/>
+          <w:lang w:bidi="ar-YE"/>
+        </w:rPr>
+        <w:t>.</w:t>
+      </w:r>
+    </w:p>
+    <w:p>
+      <w:pPr>
+        <w:bidi w:val="0"/>
+        <w:spacing w:after="0" w:line="276" w:lineRule="auto"/>
+        <w:jc w:val="both"/>
+        <w:rPr>
+          <w:rFonts w:ascii="Simplified Arabic" w:hAnsi="Simplified Arabic" w:cs="Simplified Arabic"/>
+          <w:b/>
+          <w:bCs/>
+          <w:sz w:val="28"/>
+          <w:szCs w:val="28"/>
+          <w:lang w:bidi="ar-YE"/>
+        </w:rPr>
+      </w:pPr>
+    </w:p>
+    <w:p>
+      <w:pPr>
+        <w:spacing w:after="0" w:line="276" w:lineRule="auto"/>
+        <w:jc w:val="both"/>
+        <w:rPr>
+          <w:rFonts w:ascii="Simplified Arabic" w:hAnsi="Simplified Arabic" w:cs="Simplified Arabic"/>
+          <w:b/>
+          <w:bCs/>
+          <w:sz w:val="28"/>
+          <w:szCs w:val="28"/>
           <w:rtl/>
           <w:lang w:bidi="ar-YE"/>
         </w:rPr>
@@ -4559,6 +4911,7 @@
           <w:szCs w:val="36"/>
           <w:rtl/>
         </w:rPr>
+        <w:lastRenderedPageBreak/>
         <mc:AlternateContent>
           <mc:Choice Requires="wps">
             <w:drawing>
@@ -4849,7 +5202,7 @@
 </file>
 
 <file path=word/endnotes.xml><?xml version="1.0" encoding="utf-8"?>
-<w:endnotes xmlns:wpc="http://schemas.microsoft.com/office/word/2010/wordprocessingCanvas" xmlns:cx="http://schemas.microsoft.com/office/drawing/2014/chartex" xmlns:cx1="http://schemas.microsoft.com/office/drawing/2015/9/8/chartex" xmlns:cx2="http://schemas.microsoft.com/office/drawing/2015/10/21/chartex" xmlns:cx3="http://schemas.microsoft.com/office/drawing/2016/5/9/chartex" xmlns:cx4="http://schemas.microsoft.com/office/drawing/2016/5/10/chartex" xmlns:cx5="http://schemas.microsoft.com/office/drawing/2016/5/11/chartex" xmlns:cx6="http://schemas.microsoft.com/office/drawing/2016/5/12/chartex" xmlns:cx7="http://schemas.microsoft.com/office/drawing/2016/5/13/chartex" xmlns:cx8="http://schemas.microsoft.com/office/drawing/2016/5/14/chartex" xmlns:mc="http://schemas.openxmlformats.org/markup-compatibility/2006" xmlns:aink="http://schemas.microsoft.com/office/drawing/2016/ink" xmlns:am3d="http://schemas.microsoft.com/office/drawing/2017/model3d" xmlns:o="urn:schemas-microsoft-com:office:office" xmlns:oel="http://schemas.microsoft.com/office/2019/extlst" xmlns:r="http://schemas.openxmlformats.org/officeDocument/2006/relationships" xmlns:m="http://schemas.openxmlformats.org/officeDocument/2006/math" xmlns:v="urn:schemas-microsoft-com:vml" xmlns:wp14="http://schemas.microsoft.com/office/word/2010/wordprocessingDrawing" xmlns:wp="http://schemas.openxmlformats.org/drawingml/2006/wordprocessingDrawing" xmlns:w10="urn:schemas-microsoft-com:office:word" xmlns:w="http://schemas.openxmlformats.org/wordprocessingml/2006/main" xmlns:w14="http://schemas.microsoft.com/office/word/2010/wordml" xmlns:w15="http://schemas.microsoft.com/office/word/2012/wordml" xmlns:w16cex="http://schemas.microsoft.com/office/word/2018/wordml/cex" xmlns:w16cid="http://schemas.microsoft.com/office/word/2016/wordml/cid" xmlns:w16="http://schemas.microsoft.com/office/word/2018/wordml" xmlns:w16sdtdh="http://schemas.microsoft.com/office/word/2020/wordml/sdtdatahash" xmlns:w16se="http://schemas.microsoft.com/office/word/2015/wordml/symex" xmlns:wpg="http://schemas.microsoft.com/office/word/2010/wordprocessingGroup" xmlns:wpi="http://schemas.microsoft.com/office/word/2010/wordprocessingInk" xmlns:wne="http://schemas.microsoft.com/office/word/2006/wordml" xmlns:wps="http://schemas.microsoft.com/office/word/2010/wordprocessingShape" mc:Ignorable="w14 w15 w16se w16cid w16 w16cex w16sdtdh wp14">
+<w:endnotes xmlns:wpc="http://schemas.microsoft.com/office/word/2010/wordprocessingCanvas" xmlns:cx="http://schemas.microsoft.com/office/drawing/2014/chartex" xmlns:cx1="http://schemas.microsoft.com/office/drawing/2015/9/8/chartex" xmlns:cx2="http://schemas.microsoft.com/office/drawing/2015/10/21/chartex" xmlns:cx3="http://schemas.microsoft.com/office/drawing/2016/5/9/chartex" xmlns:cx4="http://schemas.microsoft.com/office/drawing/2016/5/10/chartex" xmlns:cx5="http://schemas.microsoft.com/office/drawing/2016/5/11/chartex" xmlns:cx6="http://schemas.microsoft.com/office/drawing/2016/5/12/chartex" xmlns:cx7="http://schemas.microsoft.com/office/drawing/2016/5/13/chartex" xmlns:cx8="http://schemas.microsoft.com/office/drawing/2016/5/14/chartex" xmlns:mc="http://schemas.openxmlformats.org/markup-compatibility/2006" xmlns:aink="http://schemas.microsoft.com/office/drawing/2016/ink" xmlns:am3d="http://schemas.microsoft.com/office/drawing/2017/model3d" xmlns:o="urn:schemas-microsoft-com:office:office" xmlns:oel="http://schemas.microsoft.com/office/2019/extlst" xmlns:r="http://schemas.openxmlformats.org/officeDocument/2006/relationships" xmlns:m="http://schemas.openxmlformats.org/officeDocument/2006/math" xmlns:v="urn:schemas-microsoft-com:vml" xmlns:wp14="http://schemas.microsoft.com/office/word/2010/wordprocessingDrawing" xmlns:wp="http://schemas.openxmlformats.org/drawingml/2006/wordprocessingDrawing" xmlns:w10="urn:schemas-microsoft-com:office:word" xmlns:w="http://schemas.openxmlformats.org/wordprocessingml/2006/main" xmlns:w14="http://schemas.microsoft.com/office/word/2010/wordml" xmlns:w15="http://schemas.microsoft.com/office/word/2012/wordml" xmlns:w16cex="http://schemas.microsoft.com/office/word/2018/wordml/cex" xmlns:w16cid="http://schemas.microsoft.com/office/word/2016/wordml/cid" xmlns:w16="http://schemas.microsoft.com/office/word/2018/wordml" xmlns:w16du="http://schemas.microsoft.com/office/word/2023/wordml/word16du" xmlns:w16sdtdh="http://schemas.microsoft.com/office/word/2020/wordml/sdtdatahash" xmlns:w16sdtfl="http://schemas.microsoft.com/office/word/2024/wordml/sdtformatlock" xmlns:w16se="http://schemas.microsoft.com/office/word/2015/wordml/symex" xmlns:wpg="http://schemas.microsoft.com/office/word/2010/wordprocessingGroup" xmlns:wpi="http://schemas.microsoft.com/office/word/2010/wordprocessingInk" xmlns:wne="http://schemas.microsoft.com/office/word/2006/wordml" xmlns:wps="http://schemas.microsoft.com/office/word/2010/wordprocessingShape" mc:Ignorable="w14 w15 w16se w16cid w16 w16cex w16sdtdh w16sdtfl w16du wp14">
   <w:endnote w:type="separator" w:id="-1">
     <w:p>
       <w:pPr>
@@ -4874,7 +5227,7 @@
 </file>
 
 <file path=word/footer1.xml><?xml version="1.0" encoding="utf-8"?>
-<w:ftr xmlns:wpc="http://schemas.microsoft.com/office/word/2010/wordprocessingCanvas" xmlns:cx="http://schemas.microsoft.com/office/drawing/2014/chartex" xmlns:cx1="http://schemas.microsoft.com/office/drawing/2015/9/8/chartex" xmlns:cx2="http://schemas.microsoft.com/office/drawing/2015/10/21/chartex" xmlns:cx3="http://schemas.microsoft.com/office/drawing/2016/5/9/chartex" xmlns:cx4="http://schemas.microsoft.com/office/drawing/2016/5/10/chartex" xmlns:cx5="http://schemas.microsoft.com/office/drawing/2016/5/11/chartex" xmlns:cx6="http://schemas.microsoft.com/office/drawing/2016/5/12/chartex" xmlns:cx7="http://schemas.microsoft.com/office/drawing/2016/5/13/chartex" xmlns:cx8="http://schemas.microsoft.com/office/drawing/2016/5/14/chartex" xmlns:mc="http://schemas.openxmlformats.org/markup-compatibility/2006" xmlns:aink="http://schemas.microsoft.com/office/drawing/2016/ink" xmlns:am3d="http://schemas.microsoft.com/office/drawing/2017/model3d" xmlns:o="urn:schemas-microsoft-com:office:office" xmlns:oel="http://schemas.microsoft.com/office/2019/extlst" xmlns:r="http://schemas.openxmlformats.org/officeDocument/2006/relationships" xmlns:m="http://schemas.openxmlformats.org/officeDocument/2006/math" xmlns:v="urn:schemas-microsoft-com:vml" xmlns:wp14="http://schemas.microsoft.com/office/word/2010/wordprocessingDrawing" xmlns:wp="http://schemas.openxmlformats.org/drawingml/2006/wordprocessingDrawing" xmlns:w10="urn:schemas-microsoft-com:office:word" xmlns:w="http://schemas.openxmlformats.org/wordprocessingml/2006/main" xmlns:w14="http://schemas.microsoft.com/office/word/2010/wordml" xmlns:w15="http://schemas.microsoft.com/office/word/2012/wordml" xmlns:w16cex="http://schemas.microsoft.com/office/word/2018/wordml/cex" xmlns:w16cid="http://schemas.microsoft.com/office/word/2016/wordml/cid" xmlns:w16="http://schemas.microsoft.com/office/word/2018/wordml" xmlns:w16sdtdh="http://schemas.microsoft.com/office/word/2020/wordml/sdtdatahash" xmlns:w16se="http://schemas.microsoft.com/office/word/2015/wordml/symex" xmlns:wpg="http://schemas.microsoft.com/office/word/2010/wordprocessingGroup" xmlns:wpi="http://schemas.microsoft.com/office/word/2010/wordprocessingInk" xmlns:wne="http://schemas.microsoft.com/office/word/2006/wordml" xmlns:wps="http://schemas.microsoft.com/office/word/2010/wordprocessingShape" mc:Ignorable="w14 w15 w16se w16cid w16 w16cex w16sdtdh wp14">
+<w:ftr xmlns:wpc="http://schemas.microsoft.com/office/word/2010/wordprocessingCanvas" xmlns:cx="http://schemas.microsoft.com/office/drawing/2014/chartex" xmlns:cx1="http://schemas.microsoft.com/office/drawing/2015/9/8/chartex" xmlns:cx2="http://schemas.microsoft.com/office/drawing/2015/10/21/chartex" xmlns:cx3="http://schemas.microsoft.com/office/drawing/2016/5/9/chartex" xmlns:cx4="http://schemas.microsoft.com/office/drawing/2016/5/10/chartex" xmlns:cx5="http://schemas.microsoft.com/office/drawing/2016/5/11/chartex" xmlns:cx6="http://schemas.microsoft.com/office/drawing/2016/5/12/chartex" xmlns:cx7="http://schemas.microsoft.com/office/drawing/2016/5/13/chartex" xmlns:cx8="http://schemas.microsoft.com/office/drawing/2016/5/14/chartex" xmlns:mc="http://schemas.openxmlformats.org/markup-compatibility/2006" xmlns:aink="http://schemas.microsoft.com/office/drawing/2016/ink" xmlns:am3d="http://schemas.microsoft.com/office/drawing/2017/model3d" xmlns:o="urn:schemas-microsoft-com:office:office" xmlns:oel="http://schemas.microsoft.com/office/2019/extlst" xmlns:r="http://schemas.openxmlformats.org/officeDocument/2006/relationships" xmlns:m="http://schemas.openxmlformats.org/officeDocument/2006/math" xmlns:v="urn:schemas-microsoft-com:vml" xmlns:wp14="http://schemas.microsoft.com/office/word/2010/wordprocessingDrawing" xmlns:wp="http://schemas.openxmlformats.org/drawingml/2006/wordprocessingDrawing" xmlns:w10="urn:schemas-microsoft-com:office:word" xmlns:w="http://schemas.openxmlformats.org/wordprocessingml/2006/main" xmlns:w14="http://schemas.microsoft.com/office/word/2010/wordml" xmlns:w15="http://schemas.microsoft.com/office/word/2012/wordml" xmlns:w16cex="http://schemas.microsoft.com/office/word/2018/wordml/cex" xmlns:w16cid="http://schemas.microsoft.com/office/word/2016/wordml/cid" xmlns:w16="http://schemas.microsoft.com/office/word/2018/wordml" xmlns:w16du="http://schemas.microsoft.com/office/word/2023/wordml/word16du" xmlns:w16sdtdh="http://schemas.microsoft.com/office/word/2020/wordml/sdtdatahash" xmlns:w16sdtfl="http://schemas.microsoft.com/office/word/2024/wordml/sdtformatlock" xmlns:w16se="http://schemas.microsoft.com/office/word/2015/wordml/symex" xmlns:wpg="http://schemas.microsoft.com/office/word/2010/wordprocessingGroup" xmlns:wpi="http://schemas.microsoft.com/office/word/2010/wordprocessingInk" xmlns:wne="http://schemas.microsoft.com/office/word/2006/wordml" xmlns:wps="http://schemas.microsoft.com/office/word/2010/wordprocessingShape" mc:Ignorable="w14 w15 w16se w16cid w16 w16cex w16sdtdh w16sdtfl w16du wp14">
   <w:sdt>
     <w:sdtPr>
       <w:rPr>
@@ -4889,7 +5242,7 @@
     <w:sdtContent>
       <w:p>
         <w:pPr>
-          <w:pStyle w:val="ab"/>
+          <w:pStyle w:val="Footer"/>
           <w:jc w:val="center"/>
         </w:pPr>
         <w:r>
@@ -4916,14 +5269,14 @@
   </w:sdt>
   <w:p>
     <w:pPr>
-      <w:pStyle w:val="ab"/>
+      <w:pStyle w:val="Footer"/>
     </w:pPr>
   </w:p>
 </w:ftr>
 </file>
 
 <file path=word/footnotes.xml><?xml version="1.0" encoding="utf-8"?>
-<w:footnotes xmlns:wpc="http://schemas.microsoft.com/office/word/2010/wordprocessingCanvas" xmlns:cx="http://schemas.microsoft.com/office/drawing/2014/chartex" xmlns:cx1="http://schemas.microsoft.com/office/drawing/2015/9/8/chartex" xmlns:cx2="http://schemas.microsoft.com/office/drawing/2015/10/21/chartex" xmlns:cx3="http://schemas.microsoft.com/office/drawing/2016/5/9/chartex" xmlns:cx4="http://schemas.microsoft.com/office/drawing/2016/5/10/chartex" xmlns:cx5="http://schemas.microsoft.com/office/drawing/2016/5/11/chartex" xmlns:cx6="http://schemas.microsoft.com/office/drawing/2016/5/12/chartex" xmlns:cx7="http://schemas.microsoft.com/office/drawing/2016/5/13/chartex" xmlns:cx8="http://schemas.microsoft.com/office/drawing/2016/5/14/chartex" xmlns:mc="http://schemas.openxmlformats.org/markup-compatibility/2006" xmlns:aink="http://schemas.microsoft.com/office/drawing/2016/ink" xmlns:am3d="http://schemas.microsoft.com/office/drawing/2017/model3d" xmlns:o="urn:schemas-microsoft-com:office:office" xmlns:oel="http://schemas.microsoft.com/office/2019/extlst" xmlns:r="http://schemas.openxmlformats.org/officeDocument/2006/relationships" xmlns:m="http://schemas.openxmlformats.org/officeDocument/2006/math" xmlns:v="urn:schemas-microsoft-com:vml" xmlns:wp14="http://schemas.microsoft.com/office/word/2010/wordprocessingDrawing" xmlns:wp="http://schemas.openxmlformats.org/drawingml/2006/wordprocessingDrawing" xmlns:w10="urn:schemas-microsoft-com:office:word" xmlns:w="http://schemas.openxmlformats.org/wordprocessingml/2006/main" xmlns:w14="http://schemas.microsoft.com/office/word/2010/wordml" xmlns:w15="http://schemas.microsoft.com/office/word/2012/wordml" xmlns:w16cex="http://schemas.microsoft.com/office/word/2018/wordml/cex" xmlns:w16cid="http://schemas.microsoft.com/office/word/2016/wordml/cid" xmlns:w16="http://schemas.microsoft.com/office/word/2018/wordml" xmlns:w16sdtdh="http://schemas.microsoft.com/office/word/2020/wordml/sdtdatahash" xmlns:w16se="http://schemas.microsoft.com/office/word/2015/wordml/symex" xmlns:wpg="http://schemas.microsoft.com/office/word/2010/wordprocessingGroup" xmlns:wpi="http://schemas.microsoft.com/office/word/2010/wordprocessingInk" xmlns:wne="http://schemas.microsoft.com/office/word/2006/wordml" xmlns:wps="http://schemas.microsoft.com/office/word/2010/wordprocessingShape" mc:Ignorable="w14 w15 w16se w16cid w16 w16cex w16sdtdh wp14">
+<w:footnotes xmlns:wpc="http://schemas.microsoft.com/office/word/2010/wordprocessingCanvas" xmlns:cx="http://schemas.microsoft.com/office/drawing/2014/chartex" xmlns:cx1="http://schemas.microsoft.com/office/drawing/2015/9/8/chartex" xmlns:cx2="http://schemas.microsoft.com/office/drawing/2015/10/21/chartex" xmlns:cx3="http://schemas.microsoft.com/office/drawing/2016/5/9/chartex" xmlns:cx4="http://schemas.microsoft.com/office/drawing/2016/5/10/chartex" xmlns:cx5="http://schemas.microsoft.com/office/drawing/2016/5/11/chartex" xmlns:cx6="http://schemas.microsoft.com/office/drawing/2016/5/12/chartex" xmlns:cx7="http://schemas.microsoft.com/office/drawing/2016/5/13/chartex" xmlns:cx8="http://schemas.microsoft.com/office/drawing/2016/5/14/chartex" xmlns:mc="http://schemas.openxmlformats.org/markup-compatibility/2006" xmlns:aink="http://schemas.microsoft.com/office/drawing/2016/ink" xmlns:am3d="http://schemas.microsoft.com/office/drawing/2017/model3d" xmlns:o="urn:schemas-microsoft-com:office:office" xmlns:oel="http://schemas.microsoft.com/office/2019/extlst" xmlns:r="http://schemas.openxmlformats.org/officeDocument/2006/relationships" xmlns:m="http://schemas.openxmlformats.org/officeDocument/2006/math" xmlns:v="urn:schemas-microsoft-com:vml" xmlns:wp14="http://schemas.microsoft.com/office/word/2010/wordprocessingDrawing" xmlns:wp="http://schemas.openxmlformats.org/drawingml/2006/wordprocessingDrawing" xmlns:w10="urn:schemas-microsoft-com:office:word" xmlns:w="http://schemas.openxmlformats.org/wordprocessingml/2006/main" xmlns:w14="http://schemas.microsoft.com/office/word/2010/wordml" xmlns:w15="http://schemas.microsoft.com/office/word/2012/wordml" xmlns:w16cex="http://schemas.microsoft.com/office/word/2018/wordml/cex" xmlns:w16cid="http://schemas.microsoft.com/office/word/2016/wordml/cid" xmlns:w16="http://schemas.microsoft.com/office/word/2018/wordml" xmlns:w16du="http://schemas.microsoft.com/office/word/2023/wordml/word16du" xmlns:w16sdtdh="http://schemas.microsoft.com/office/word/2020/wordml/sdtdatahash" xmlns:w16sdtfl="http://schemas.microsoft.com/office/word/2024/wordml/sdtformatlock" xmlns:w16se="http://schemas.microsoft.com/office/word/2015/wordml/symex" xmlns:wpg="http://schemas.microsoft.com/office/word/2010/wordprocessingGroup" xmlns:wpi="http://schemas.microsoft.com/office/word/2010/wordprocessingInk" xmlns:wne="http://schemas.microsoft.com/office/word/2006/wordml" xmlns:wps="http://schemas.microsoft.com/office/word/2010/wordprocessingShape" mc:Ignorable="w14 w15 w16se w16cid w16 w16cex w16sdtdh w16sdtfl w16du wp14">
   <w:footnote w:type="separator" w:id="-1">
     <w:p>
       <w:pPr>
@@ -4948,7 +5301,7 @@
 </file>
 
 <file path=word/numbering.xml><?xml version="1.0" encoding="utf-8"?>
-<w:numbering xmlns:wpc="http://schemas.microsoft.com/office/word/2010/wordprocessingCanvas" xmlns:cx="http://schemas.microsoft.com/office/drawing/2014/chartex" xmlns:cx1="http://schemas.microsoft.com/office/drawing/2015/9/8/chartex" xmlns:cx2="http://schemas.microsoft.com/office/drawing/2015/10/21/chartex" xmlns:cx3="http://schemas.microsoft.com/office/drawing/2016/5/9/chartex" xmlns:cx4="http://schemas.microsoft.com/office/drawing/2016/5/10/chartex" xmlns:cx5="http://schemas.microsoft.com/office/drawing/2016/5/11/chartex" xmlns:cx6="http://schemas.microsoft.com/office/drawing/2016/5/12/chartex" xmlns:cx7="http://schemas.microsoft.com/office/drawing/2016/5/13/chartex" xmlns:cx8="http://schemas.microsoft.com/office/drawing/2016/5/14/chartex" xmlns:mc="http://schemas.openxmlformats.org/markup-compatibility/2006" xmlns:aink="http://schemas.microsoft.com/office/drawing/2016/ink" xmlns:am3d="http://schemas.microsoft.com/office/drawing/2017/model3d" xmlns:o="urn:schemas-microsoft-com:office:office" xmlns:oel="http://schemas.microsoft.com/office/2019/extlst" xmlns:r="http://schemas.openxmlformats.org/officeDocument/2006/relationships" xmlns:m="http://schemas.openxmlformats.org/officeDocument/2006/math" xmlns:v="urn:schemas-microsoft-com:vml" xmlns:wp14="http://schemas.microsoft.com/office/word/2010/wordprocessingDrawing" xmlns:wp="http://schemas.openxmlformats.org/drawingml/2006/wordprocessingDrawing" xmlns:w10="urn:schemas-microsoft-com:office:word" xmlns:w="http://schemas.openxmlformats.org/wordprocessingml/2006/main" xmlns:w14="http://schemas.microsoft.com/office/word/2010/wordml" xmlns:w15="http://schemas.microsoft.com/office/word/2012/wordml" xmlns:w16cex="http://schemas.microsoft.com/office/word/2018/wordml/cex" xmlns:w16cid="http://schemas.microsoft.com/office/word/2016/wordml/cid" xmlns:w16="http://schemas.microsoft.com/office/word/2018/wordml" xmlns:w16sdtdh="http://schemas.microsoft.com/office/word/2020/wordml/sdtdatahash" xmlns:w16se="http://schemas.microsoft.com/office/word/2015/wordml/symex" xmlns:wpg="http://schemas.microsoft.com/office/word/2010/wordprocessingGroup" xmlns:wpi="http://schemas.microsoft.com/office/word/2010/wordprocessingInk" xmlns:wne="http://schemas.microsoft.com/office/word/2006/wordml" xmlns:wps="http://schemas.microsoft.com/office/word/2010/wordprocessingShape" mc:Ignorable="w14 w15 w16se w16cid w16 w16cex w16sdtdh wp14">
+<w:numbering xmlns:wpc="http://schemas.microsoft.com/office/word/2010/wordprocessingCanvas" xmlns:cx="http://schemas.microsoft.com/office/drawing/2014/chartex" xmlns:cx1="http://schemas.microsoft.com/office/drawing/2015/9/8/chartex" xmlns:cx2="http://schemas.microsoft.com/office/drawing/2015/10/21/chartex" xmlns:cx3="http://schemas.microsoft.com/office/drawing/2016/5/9/chartex" xmlns:cx4="http://schemas.microsoft.com/office/drawing/2016/5/10/chartex" xmlns:cx5="http://schemas.microsoft.com/office/drawing/2016/5/11/chartex" xmlns:cx6="http://schemas.microsoft.com/office/drawing/2016/5/12/chartex" xmlns:cx7="http://schemas.microsoft.com/office/drawing/2016/5/13/chartex" xmlns:cx8="http://schemas.microsoft.com/office/drawing/2016/5/14/chartex" xmlns:mc="http://schemas.openxmlformats.org/markup-compatibility/2006" xmlns:aink="http://schemas.microsoft.com/office/drawing/2016/ink" xmlns:am3d="http://schemas.microsoft.com/office/drawing/2017/model3d" xmlns:o="urn:schemas-microsoft-com:office:office" xmlns:oel="http://schemas.microsoft.com/office/2019/extlst" xmlns:r="http://schemas.openxmlformats.org/officeDocument/2006/relationships" xmlns:m="http://schemas.openxmlformats.org/officeDocument/2006/math" xmlns:v="urn:schemas-microsoft-com:vml" xmlns:wp14="http://schemas.microsoft.com/office/word/2010/wordprocessingDrawing" xmlns:wp="http://schemas.openxmlformats.org/drawingml/2006/wordprocessingDrawing" xmlns:w10="urn:schemas-microsoft-com:office:word" xmlns:w="http://schemas.openxmlformats.org/wordprocessingml/2006/main" xmlns:w14="http://schemas.microsoft.com/office/word/2010/wordml" xmlns:w15="http://schemas.microsoft.com/office/word/2012/wordml" xmlns:w16cex="http://schemas.microsoft.com/office/word/2018/wordml/cex" xmlns:w16cid="http://schemas.microsoft.com/office/word/2016/wordml/cid" xmlns:w16="http://schemas.microsoft.com/office/word/2018/wordml" xmlns:w16du="http://schemas.microsoft.com/office/word/2023/wordml/word16du" xmlns:w16sdtdh="http://schemas.microsoft.com/office/word/2020/wordml/sdtdatahash" xmlns:w16sdtfl="http://schemas.microsoft.com/office/word/2024/wordml/sdtformatlock" xmlns:w16se="http://schemas.microsoft.com/office/word/2015/wordml/symex" xmlns:wpg="http://schemas.microsoft.com/office/word/2010/wordprocessingGroup" xmlns:wpi="http://schemas.microsoft.com/office/word/2010/wordprocessingInk" xmlns:wne="http://schemas.microsoft.com/office/word/2006/wordml" xmlns:wps="http://schemas.microsoft.com/office/word/2010/wordprocessingShape" mc:Ignorable="w14 w15 w16se w16cid w16 w16cex w16sdtdh w16sdtfl w16du wp14">
   <w:abstractNum w:abstractNumId="0" w15:restartNumberingAfterBreak="0">
     <w:nsid w:val="029959AE"/>
     <w:multiLevelType w:val="hybridMultilevel"/>
@@ -8525,7 +8878,7 @@
 </file>
 
 <file path=word/styles.xml><?xml version="1.0" encoding="utf-8"?>
-<w:styles xmlns:mc="http://schemas.openxmlformats.org/markup-compatibility/2006" xmlns:r="http://schemas.openxmlformats.org/officeDocument/2006/relationships" xmlns:w="http://schemas.openxmlformats.org/wordprocessingml/2006/main" xmlns:w14="http://schemas.microsoft.com/office/word/2010/wordml" xmlns:w15="http://schemas.microsoft.com/office/word/2012/wordml" xmlns:w16cex="http://schemas.microsoft.com/office/word/2018/wordml/cex" xmlns:w16cid="http://schemas.microsoft.com/office/word/2016/wordml/cid" xmlns:w16="http://schemas.microsoft.com/office/word/2018/wordml" xmlns:w16sdtdh="http://schemas.microsoft.com/office/word/2020/wordml/sdtdatahash" xmlns:w16se="http://schemas.microsoft.com/office/word/2015/wordml/symex" mc:Ignorable="w14 w15 w16se w16cid w16 w16cex w16sdtdh">
+<w:styles xmlns:mc="http://schemas.openxmlformats.org/markup-compatibility/2006" xmlns:r="http://schemas.openxmlformats.org/officeDocument/2006/relationships" xmlns:w="http://schemas.openxmlformats.org/wordprocessingml/2006/main" xmlns:w14="http://schemas.microsoft.com/office/word/2010/wordml" xmlns:w15="http://schemas.microsoft.com/office/word/2012/wordml" xmlns:w16cex="http://schemas.microsoft.com/office/word/2018/wordml/cex" xmlns:w16cid="http://schemas.microsoft.com/office/word/2016/wordml/cid" xmlns:w16="http://schemas.microsoft.com/office/word/2018/wordml" xmlns:w16du="http://schemas.microsoft.com/office/word/2023/wordml/word16du" xmlns:w16sdtdh="http://schemas.microsoft.com/office/word/2020/wordml/sdtdatahash" xmlns:w16sdtfl="http://schemas.microsoft.com/office/word/2024/wordml/sdtformatlock" xmlns:w16se="http://schemas.microsoft.com/office/word/2015/wordml/symex" mc:Ignorable="w14 w15 w16se w16cid w16 w16cex w16sdtdh w16sdtfl w16du">
   <w:docDefaults>
     <w:rPrDefault>
       <w:rPr>
@@ -8921,18 +9274,18 @@
     <w:lsdException w:name="Unresolved Mention" w:semiHidden="1" w:unhideWhenUsed="1"/>
     <w:lsdException w:name="Smart Link" w:semiHidden="1" w:unhideWhenUsed="1"/>
   </w:latentStyles>
-  <w:style w:type="paragraph" w:default="1" w:styleId="a">
+  <w:style w:type="paragraph" w:default="1" w:styleId="Normal">
     <w:name w:val="Normal"/>
     <w:qFormat/>
     <w:pPr>
       <w:bidi/>
     </w:pPr>
   </w:style>
-  <w:style w:type="paragraph" w:styleId="1">
+  <w:style w:type="paragraph" w:styleId="Heading1">
     <w:name w:val="heading 1"/>
-    <w:basedOn w:val="a"/>
-    <w:next w:val="a"/>
-    <w:link w:val="1Char"/>
+    <w:basedOn w:val="Normal"/>
+    <w:next w:val="Normal"/>
+    <w:link w:val="Heading1Char"/>
     <w:uiPriority w:val="9"/>
     <w:qFormat/>
     <w:rsid w:val="00DD34AE"/>
@@ -8949,11 +9302,11 @@
       <w:szCs w:val="40"/>
     </w:rPr>
   </w:style>
-  <w:style w:type="paragraph" w:styleId="2">
+  <w:style w:type="paragraph" w:styleId="Heading2">
     <w:name w:val="heading 2"/>
-    <w:basedOn w:val="a"/>
-    <w:next w:val="a"/>
-    <w:link w:val="2Char"/>
+    <w:basedOn w:val="Normal"/>
+    <w:next w:val="Normal"/>
+    <w:link w:val="Heading2Char"/>
     <w:uiPriority w:val="9"/>
     <w:semiHidden/>
     <w:unhideWhenUsed/>
@@ -8972,11 +9325,11 @@
       <w:szCs w:val="32"/>
     </w:rPr>
   </w:style>
-  <w:style w:type="paragraph" w:styleId="3">
+  <w:style w:type="paragraph" w:styleId="Heading3">
     <w:name w:val="heading 3"/>
-    <w:basedOn w:val="a"/>
-    <w:next w:val="a"/>
-    <w:link w:val="3Char"/>
+    <w:basedOn w:val="Normal"/>
+    <w:next w:val="Normal"/>
+    <w:link w:val="Heading3Char"/>
     <w:uiPriority w:val="9"/>
     <w:semiHidden/>
     <w:unhideWhenUsed/>
@@ -8995,11 +9348,11 @@
       <w:szCs w:val="28"/>
     </w:rPr>
   </w:style>
-  <w:style w:type="paragraph" w:styleId="4">
+  <w:style w:type="paragraph" w:styleId="Heading4">
     <w:name w:val="heading 4"/>
-    <w:basedOn w:val="a"/>
-    <w:next w:val="a"/>
-    <w:link w:val="4Char"/>
+    <w:basedOn w:val="Normal"/>
+    <w:next w:val="Normal"/>
+    <w:link w:val="Heading4Char"/>
     <w:uiPriority w:val="9"/>
     <w:semiHidden/>
     <w:unhideWhenUsed/>
@@ -9018,11 +9371,11 @@
       <w:color w:val="0F4761" w:themeColor="accent1" w:themeShade="BF"/>
     </w:rPr>
   </w:style>
-  <w:style w:type="paragraph" w:styleId="5">
+  <w:style w:type="paragraph" w:styleId="Heading5">
     <w:name w:val="heading 5"/>
-    <w:basedOn w:val="a"/>
-    <w:next w:val="a"/>
-    <w:link w:val="5Char"/>
+    <w:basedOn w:val="Normal"/>
+    <w:next w:val="Normal"/>
+    <w:link w:val="Heading5Char"/>
     <w:uiPriority w:val="9"/>
     <w:semiHidden/>
     <w:unhideWhenUsed/>
@@ -9039,11 +9392,11 @@
       <w:color w:val="0F4761" w:themeColor="accent1" w:themeShade="BF"/>
     </w:rPr>
   </w:style>
-  <w:style w:type="paragraph" w:styleId="6">
+  <w:style w:type="paragraph" w:styleId="Heading6">
     <w:name w:val="heading 6"/>
-    <w:basedOn w:val="a"/>
-    <w:next w:val="a"/>
-    <w:link w:val="6Char"/>
+    <w:basedOn w:val="Normal"/>
+    <w:next w:val="Normal"/>
+    <w:link w:val="Heading6Char"/>
     <w:uiPriority w:val="9"/>
     <w:semiHidden/>
     <w:unhideWhenUsed/>
@@ -9062,11 +9415,11 @@
       <w:color w:val="595959" w:themeColor="text1" w:themeTint="A6"/>
     </w:rPr>
   </w:style>
-  <w:style w:type="paragraph" w:styleId="7">
+  <w:style w:type="paragraph" w:styleId="Heading7">
     <w:name w:val="heading 7"/>
-    <w:basedOn w:val="a"/>
-    <w:next w:val="a"/>
-    <w:link w:val="7Char"/>
+    <w:basedOn w:val="Normal"/>
+    <w:next w:val="Normal"/>
+    <w:link w:val="Heading7Char"/>
     <w:uiPriority w:val="9"/>
     <w:semiHidden/>
     <w:unhideWhenUsed/>
@@ -9083,11 +9436,11 @@
       <w:color w:val="595959" w:themeColor="text1" w:themeTint="A6"/>
     </w:rPr>
   </w:style>
-  <w:style w:type="paragraph" w:styleId="8">
+  <w:style w:type="paragraph" w:styleId="Heading8">
     <w:name w:val="heading 8"/>
-    <w:basedOn w:val="a"/>
-    <w:next w:val="a"/>
-    <w:link w:val="8Char"/>
+    <w:basedOn w:val="Normal"/>
+    <w:next w:val="Normal"/>
+    <w:link w:val="Heading8Char"/>
     <w:uiPriority w:val="9"/>
     <w:semiHidden/>
     <w:unhideWhenUsed/>
@@ -9106,11 +9459,11 @@
       <w:color w:val="272727" w:themeColor="text1" w:themeTint="D8"/>
     </w:rPr>
   </w:style>
-  <w:style w:type="paragraph" w:styleId="9">
+  <w:style w:type="paragraph" w:styleId="Heading9">
     <w:name w:val="heading 9"/>
-    <w:basedOn w:val="a"/>
-    <w:next w:val="a"/>
-    <w:link w:val="9Char"/>
+    <w:basedOn w:val="Normal"/>
+    <w:next w:val="Normal"/>
+    <w:link w:val="Heading9Char"/>
     <w:uiPriority w:val="9"/>
     <w:semiHidden/>
     <w:unhideWhenUsed/>
@@ -9127,13 +9480,12 @@
       <w:color w:val="272727" w:themeColor="text1" w:themeTint="D8"/>
     </w:rPr>
   </w:style>
-  <w:style w:type="character" w:default="1" w:styleId="a0">
+  <w:style w:type="character" w:default="1" w:styleId="DefaultParagraphFont">
     <w:name w:val="Default Paragraph Font"/>
     <w:uiPriority w:val="1"/>
-    <w:semiHidden/>
     <w:unhideWhenUsed/>
   </w:style>
-  <w:style w:type="table" w:default="1" w:styleId="a1">
+  <w:style w:type="table" w:default="1" w:styleId="TableNormal">
     <w:name w:val="Normal Table"/>
     <w:uiPriority w:val="99"/>
     <w:semiHidden/>
@@ -9148,16 +9500,16 @@
       </w:tblCellMar>
     </w:tblPr>
   </w:style>
-  <w:style w:type="numbering" w:default="1" w:styleId="a2">
+  <w:style w:type="numbering" w:default="1" w:styleId="NoList">
     <w:name w:val="No List"/>
     <w:uiPriority w:val="99"/>
     <w:semiHidden/>
     <w:unhideWhenUsed/>
   </w:style>
-  <w:style w:type="character" w:customStyle="1" w:styleId="1Char">
-    <w:name w:val="العنوان 1 Char"/>
-    <w:basedOn w:val="a0"/>
-    <w:link w:val="1"/>
+  <w:style w:type="character" w:customStyle="1" w:styleId="Heading1Char">
+    <w:name w:val="Heading 1 Char"/>
+    <w:basedOn w:val="DefaultParagraphFont"/>
+    <w:link w:val="Heading1"/>
     <w:uiPriority w:val="9"/>
     <w:rsid w:val="00DD34AE"/>
     <w:rPr>
@@ -9167,10 +9519,10 @@
       <w:szCs w:val="40"/>
     </w:rPr>
   </w:style>
-  <w:style w:type="character" w:customStyle="1" w:styleId="2Char">
-    <w:name w:val="عنوان 2 Char"/>
-    <w:basedOn w:val="a0"/>
-    <w:link w:val="2"/>
+  <w:style w:type="character" w:customStyle="1" w:styleId="Heading2Char">
+    <w:name w:val="Heading 2 Char"/>
+    <w:basedOn w:val="DefaultParagraphFont"/>
+    <w:link w:val="Heading2"/>
     <w:uiPriority w:val="9"/>
     <w:semiHidden/>
     <w:rsid w:val="00DD34AE"/>
@@ -9181,10 +9533,10 @@
       <w:szCs w:val="32"/>
     </w:rPr>
   </w:style>
-  <w:style w:type="character" w:customStyle="1" w:styleId="3Char">
-    <w:name w:val="عنوان 3 Char"/>
-    <w:basedOn w:val="a0"/>
-    <w:link w:val="3"/>
+  <w:style w:type="character" w:customStyle="1" w:styleId="Heading3Char">
+    <w:name w:val="Heading 3 Char"/>
+    <w:basedOn w:val="DefaultParagraphFont"/>
+    <w:link w:val="Heading3"/>
     <w:uiPriority w:val="9"/>
     <w:semiHidden/>
     <w:rsid w:val="00DD34AE"/>
@@ -9195,10 +9547,10 @@
       <w:szCs w:val="28"/>
     </w:rPr>
   </w:style>
-  <w:style w:type="character" w:customStyle="1" w:styleId="4Char">
-    <w:name w:val="عنوان 4 Char"/>
-    <w:basedOn w:val="a0"/>
-    <w:link w:val="4"/>
+  <w:style w:type="character" w:customStyle="1" w:styleId="Heading4Char">
+    <w:name w:val="Heading 4 Char"/>
+    <w:basedOn w:val="DefaultParagraphFont"/>
+    <w:link w:val="Heading4"/>
     <w:uiPriority w:val="9"/>
     <w:semiHidden/>
     <w:rsid w:val="00DD34AE"/>
@@ -9209,10 +9561,10 @@
       <w:color w:val="0F4761" w:themeColor="accent1" w:themeShade="BF"/>
     </w:rPr>
   </w:style>
-  <w:style w:type="character" w:customStyle="1" w:styleId="5Char">
-    <w:name w:val="عنوان 5 Char"/>
-    <w:basedOn w:val="a0"/>
-    <w:link w:val="5"/>
+  <w:style w:type="character" w:customStyle="1" w:styleId="Heading5Char">
+    <w:name w:val="Heading 5 Char"/>
+    <w:basedOn w:val="DefaultParagraphFont"/>
+    <w:link w:val="Heading5"/>
     <w:uiPriority w:val="9"/>
     <w:semiHidden/>
     <w:rsid w:val="00DD34AE"/>
@@ -9221,10 +9573,10 @@
       <w:color w:val="0F4761" w:themeColor="accent1" w:themeShade="BF"/>
     </w:rPr>
   </w:style>
-  <w:style w:type="character" w:customStyle="1" w:styleId="6Char">
-    <w:name w:val="عنوان 6 Char"/>
-    <w:basedOn w:val="a0"/>
-    <w:link w:val="6"/>
+  <w:style w:type="character" w:customStyle="1" w:styleId="Heading6Char">
+    <w:name w:val="Heading 6 Char"/>
+    <w:basedOn w:val="DefaultParagraphFont"/>
+    <w:link w:val="Heading6"/>
     <w:uiPriority w:val="9"/>
     <w:semiHidden/>
     <w:rsid w:val="00DD34AE"/>
@@ -9235,10 +9587,10 @@
       <w:color w:val="595959" w:themeColor="text1" w:themeTint="A6"/>
     </w:rPr>
   </w:style>
-  <w:style w:type="character" w:customStyle="1" w:styleId="7Char">
-    <w:name w:val="عنوان 7 Char"/>
-    <w:basedOn w:val="a0"/>
-    <w:link w:val="7"/>
+  <w:style w:type="character" w:customStyle="1" w:styleId="Heading7Char">
+    <w:name w:val="Heading 7 Char"/>
+    <w:basedOn w:val="DefaultParagraphFont"/>
+    <w:link w:val="Heading7"/>
     <w:uiPriority w:val="9"/>
     <w:semiHidden/>
     <w:rsid w:val="00DD34AE"/>
@@ -9247,10 +9599,10 @@
       <w:color w:val="595959" w:themeColor="text1" w:themeTint="A6"/>
     </w:rPr>
   </w:style>
-  <w:style w:type="character" w:customStyle="1" w:styleId="8Char">
-    <w:name w:val="عنوان 8 Char"/>
-    <w:basedOn w:val="a0"/>
-    <w:link w:val="8"/>
+  <w:style w:type="character" w:customStyle="1" w:styleId="Heading8Char">
+    <w:name w:val="Heading 8 Char"/>
+    <w:basedOn w:val="DefaultParagraphFont"/>
+    <w:link w:val="Heading8"/>
     <w:uiPriority w:val="9"/>
     <w:semiHidden/>
     <w:rsid w:val="00DD34AE"/>
@@ -9261,10 +9613,10 @@
       <w:color w:val="272727" w:themeColor="text1" w:themeTint="D8"/>
     </w:rPr>
   </w:style>
-  <w:style w:type="character" w:customStyle="1" w:styleId="9Char">
-    <w:name w:val="عنوان 9 Char"/>
-    <w:basedOn w:val="a0"/>
-    <w:link w:val="9"/>
+  <w:style w:type="character" w:customStyle="1" w:styleId="Heading9Char">
+    <w:name w:val="Heading 9 Char"/>
+    <w:basedOn w:val="DefaultParagraphFont"/>
+    <w:link w:val="Heading9"/>
     <w:uiPriority w:val="9"/>
     <w:semiHidden/>
     <w:rsid w:val="00DD34AE"/>
@@ -9273,11 +9625,11 @@
       <w:color w:val="272727" w:themeColor="text1" w:themeTint="D8"/>
     </w:rPr>
   </w:style>
-  <w:style w:type="paragraph" w:styleId="a3">
+  <w:style w:type="paragraph" w:styleId="Title">
     <w:name w:val="Title"/>
-    <w:basedOn w:val="a"/>
-    <w:next w:val="a"/>
-    <w:link w:val="Char"/>
+    <w:basedOn w:val="Normal"/>
+    <w:next w:val="Normal"/>
+    <w:link w:val="TitleChar"/>
     <w:uiPriority w:val="10"/>
     <w:qFormat/>
     <w:rsid w:val="00DD34AE"/>
@@ -9293,10 +9645,10 @@
       <w:szCs w:val="56"/>
     </w:rPr>
   </w:style>
-  <w:style w:type="character" w:customStyle="1" w:styleId="Char">
-    <w:name w:val="العنوان Char"/>
-    <w:basedOn w:val="a0"/>
-    <w:link w:val="a3"/>
+  <w:style w:type="character" w:customStyle="1" w:styleId="TitleChar">
+    <w:name w:val="Title Char"/>
+    <w:basedOn w:val="DefaultParagraphFont"/>
+    <w:link w:val="Title"/>
     <w:uiPriority w:val="10"/>
     <w:rsid w:val="00DD34AE"/>
     <w:rPr>
@@ -9307,11 +9659,11 @@
       <w:szCs w:val="56"/>
     </w:rPr>
   </w:style>
-  <w:style w:type="paragraph" w:styleId="a4">
+  <w:style w:type="paragraph" w:styleId="Subtitle">
     <w:name w:val="Subtitle"/>
-    <w:basedOn w:val="a"/>
-    <w:next w:val="a"/>
-    <w:link w:val="Char0"/>
+    <w:basedOn w:val="Normal"/>
+    <w:next w:val="Normal"/>
+    <w:link w:val="SubtitleChar"/>
     <w:uiPriority w:val="11"/>
     <w:qFormat/>
     <w:rsid w:val="00DD34AE"/>
@@ -9328,10 +9680,10 @@
       <w:szCs w:val="28"/>
     </w:rPr>
   </w:style>
-  <w:style w:type="character" w:customStyle="1" w:styleId="Char0">
-    <w:name w:val="عنوان فرعي Char"/>
-    <w:basedOn w:val="a0"/>
-    <w:link w:val="a4"/>
+  <w:style w:type="character" w:customStyle="1" w:styleId="SubtitleChar">
+    <w:name w:val="Subtitle Char"/>
+    <w:basedOn w:val="DefaultParagraphFont"/>
+    <w:link w:val="Subtitle"/>
     <w:uiPriority w:val="11"/>
     <w:rsid w:val="00DD34AE"/>
     <w:rPr>
@@ -9342,11 +9694,11 @@
       <w:szCs w:val="28"/>
     </w:rPr>
   </w:style>
-  <w:style w:type="paragraph" w:styleId="a5">
+  <w:style w:type="paragraph" w:styleId="Quote">
     <w:name w:val="Quote"/>
-    <w:basedOn w:val="a"/>
-    <w:next w:val="a"/>
-    <w:link w:val="Char1"/>
+    <w:basedOn w:val="Normal"/>
+    <w:next w:val="Normal"/>
+    <w:link w:val="QuoteChar"/>
     <w:uiPriority w:val="29"/>
     <w:qFormat/>
     <w:rsid w:val="00DD34AE"/>
@@ -9360,10 +9712,10 @@
       <w:color w:val="404040" w:themeColor="text1" w:themeTint="BF"/>
     </w:rPr>
   </w:style>
-  <w:style w:type="character" w:customStyle="1" w:styleId="Char1">
-    <w:name w:val="اقتباس Char"/>
-    <w:basedOn w:val="a0"/>
-    <w:link w:val="a5"/>
+  <w:style w:type="character" w:customStyle="1" w:styleId="QuoteChar">
+    <w:name w:val="Quote Char"/>
+    <w:basedOn w:val="DefaultParagraphFont"/>
+    <w:link w:val="Quote"/>
     <w:uiPriority w:val="29"/>
     <w:rsid w:val="00DD34AE"/>
     <w:rPr>
@@ -9372,9 +9724,9 @@
       <w:color w:val="404040" w:themeColor="text1" w:themeTint="BF"/>
     </w:rPr>
   </w:style>
-  <w:style w:type="paragraph" w:styleId="a6">
+  <w:style w:type="paragraph" w:styleId="ListParagraph">
     <w:name w:val="List Paragraph"/>
-    <w:basedOn w:val="a"/>
+    <w:basedOn w:val="Normal"/>
     <w:uiPriority w:val="34"/>
     <w:qFormat/>
     <w:rsid w:val="00DD34AE"/>
@@ -9383,9 +9735,9 @@
       <w:contextualSpacing/>
     </w:pPr>
   </w:style>
-  <w:style w:type="character" w:styleId="a7">
+  <w:style w:type="character" w:styleId="IntenseEmphasis">
     <w:name w:val="Intense Emphasis"/>
-    <w:basedOn w:val="a0"/>
+    <w:basedOn w:val="DefaultParagraphFont"/>
     <w:uiPriority w:val="21"/>
     <w:qFormat/>
     <w:rsid w:val="00DD34AE"/>
@@ -9395,11 +9747,11 @@
       <w:color w:val="0F4761" w:themeColor="accent1" w:themeShade="BF"/>
     </w:rPr>
   </w:style>
-  <w:style w:type="paragraph" w:styleId="a8">
+  <w:style w:type="paragraph" w:styleId="IntenseQuote">
     <w:name w:val="Intense Quote"/>
-    <w:basedOn w:val="a"/>
-    <w:next w:val="a"/>
-    <w:link w:val="Char2"/>
+    <w:basedOn w:val="Normal"/>
+    <w:next w:val="Normal"/>
+    <w:link w:val="IntenseQuoteChar"/>
     <w:uiPriority w:val="30"/>
     <w:qFormat/>
     <w:rsid w:val="00DD34AE"/>
@@ -9418,10 +9770,10 @@
       <w:color w:val="0F4761" w:themeColor="accent1" w:themeShade="BF"/>
     </w:rPr>
   </w:style>
-  <w:style w:type="character" w:customStyle="1" w:styleId="Char2">
-    <w:name w:val="اقتباس مكثف Char"/>
-    <w:basedOn w:val="a0"/>
-    <w:link w:val="a8"/>
+  <w:style w:type="character" w:customStyle="1" w:styleId="IntenseQuoteChar">
+    <w:name w:val="Intense Quote Char"/>
+    <w:basedOn w:val="DefaultParagraphFont"/>
+    <w:link w:val="IntenseQuote"/>
     <w:uiPriority w:val="30"/>
     <w:rsid w:val="00DD34AE"/>
     <w:rPr>
@@ -9430,9 +9782,9 @@
       <w:color w:val="0F4761" w:themeColor="accent1" w:themeShade="BF"/>
     </w:rPr>
   </w:style>
-  <w:style w:type="character" w:styleId="a9">
+  <w:style w:type="character" w:styleId="IntenseReference">
     <w:name w:val="Intense Reference"/>
-    <w:basedOn w:val="a0"/>
+    <w:basedOn w:val="DefaultParagraphFont"/>
     <w:uiPriority w:val="32"/>
     <w:qFormat/>
     <w:rsid w:val="00DD34AE"/>
@@ -9444,10 +9796,10 @@
       <w:spacing w:val="5"/>
     </w:rPr>
   </w:style>
-  <w:style w:type="paragraph" w:styleId="aa">
+  <w:style w:type="paragraph" w:styleId="Header">
     <w:name w:val="header"/>
-    <w:basedOn w:val="a"/>
-    <w:link w:val="Char3"/>
+    <w:basedOn w:val="Normal"/>
+    <w:link w:val="HeaderChar"/>
     <w:uiPriority w:val="99"/>
     <w:unhideWhenUsed/>
     <w:rsid w:val="00921238"/>
@@ -9459,17 +9811,17 @@
       <w:spacing w:after="0" w:line="240" w:lineRule="auto"/>
     </w:pPr>
   </w:style>
-  <w:style w:type="character" w:customStyle="1" w:styleId="Char3">
-    <w:name w:val="رأس الصفحة Char"/>
-    <w:basedOn w:val="a0"/>
-    <w:link w:val="aa"/>
+  <w:style w:type="character" w:customStyle="1" w:styleId="HeaderChar">
+    <w:name w:val="Header Char"/>
+    <w:basedOn w:val="DefaultParagraphFont"/>
+    <w:link w:val="Header"/>
     <w:uiPriority w:val="99"/>
     <w:rsid w:val="00921238"/>
   </w:style>
-  <w:style w:type="paragraph" w:styleId="ab">
+  <w:style w:type="paragraph" w:styleId="Footer">
     <w:name w:val="footer"/>
-    <w:basedOn w:val="a"/>
-    <w:link w:val="Char4"/>
+    <w:basedOn w:val="Normal"/>
+    <w:link w:val="FooterChar"/>
     <w:uiPriority w:val="99"/>
     <w:unhideWhenUsed/>
     <w:rsid w:val="00921238"/>
@@ -9481,16 +9833,16 @@
       <w:spacing w:after="0" w:line="240" w:lineRule="auto"/>
     </w:pPr>
   </w:style>
-  <w:style w:type="character" w:customStyle="1" w:styleId="Char4">
-    <w:name w:val="تذييل الصفحة Char"/>
-    <w:basedOn w:val="a0"/>
-    <w:link w:val="ab"/>
+  <w:style w:type="character" w:customStyle="1" w:styleId="FooterChar">
+    <w:name w:val="Footer Char"/>
+    <w:basedOn w:val="DefaultParagraphFont"/>
+    <w:link w:val="Footer"/>
     <w:uiPriority w:val="99"/>
     <w:rsid w:val="00921238"/>
   </w:style>
-  <w:style w:type="table" w:styleId="ac">
+  <w:style w:type="table" w:styleId="TableGrid">
     <w:name w:val="Table Grid"/>
-    <w:basedOn w:val="a1"/>
+    <w:basedOn w:val="TableNormal"/>
     <w:uiPriority w:val="39"/>
     <w:rsid w:val="00724FC2"/>
     <w:pPr>
@@ -9507,9 +9859,9 @@
       </w:tblBorders>
     </w:tblPr>
   </w:style>
-  <w:style w:type="character" w:styleId="ad">
+  <w:style w:type="character" w:styleId="CommentReference">
     <w:name w:val="annotation reference"/>
-    <w:basedOn w:val="a0"/>
+    <w:basedOn w:val="DefaultParagraphFont"/>
     <w:uiPriority w:val="99"/>
     <w:semiHidden/>
     <w:unhideWhenUsed/>
@@ -9519,10 +9871,10 @@
       <w:szCs w:val="16"/>
     </w:rPr>
   </w:style>
-  <w:style w:type="paragraph" w:styleId="ae">
+  <w:style w:type="paragraph" w:styleId="CommentText">
     <w:name w:val="annotation text"/>
-    <w:basedOn w:val="a"/>
-    <w:link w:val="Char5"/>
+    <w:basedOn w:val="Normal"/>
+    <w:link w:val="CommentTextChar"/>
     <w:uiPriority w:val="99"/>
     <w:semiHidden/>
     <w:unhideWhenUsed/>
@@ -9535,10 +9887,10 @@
       <w:szCs w:val="20"/>
     </w:rPr>
   </w:style>
-  <w:style w:type="character" w:customStyle="1" w:styleId="Char5">
-    <w:name w:val="نص تعليق Char"/>
-    <w:basedOn w:val="a0"/>
-    <w:link w:val="ae"/>
+  <w:style w:type="character" w:customStyle="1" w:styleId="CommentTextChar">
+    <w:name w:val="Comment Text Char"/>
+    <w:basedOn w:val="DefaultParagraphFont"/>
+    <w:link w:val="CommentText"/>
     <w:uiPriority w:val="99"/>
     <w:semiHidden/>
     <w:rsid w:val="005F2DAF"/>
@@ -9547,11 +9899,11 @@
       <w:szCs w:val="20"/>
     </w:rPr>
   </w:style>
-  <w:style w:type="paragraph" w:styleId="af">
+  <w:style w:type="paragraph" w:styleId="CommentSubject">
     <w:name w:val="annotation subject"/>
-    <w:basedOn w:val="ae"/>
-    <w:next w:val="ae"/>
-    <w:link w:val="Char6"/>
+    <w:basedOn w:val="CommentText"/>
+    <w:next w:val="CommentText"/>
+    <w:link w:val="CommentSubjectChar"/>
     <w:uiPriority w:val="99"/>
     <w:semiHidden/>
     <w:unhideWhenUsed/>
@@ -9561,10 +9913,10 @@
       <w:bCs/>
     </w:rPr>
   </w:style>
-  <w:style w:type="character" w:customStyle="1" w:styleId="Char6">
-    <w:name w:val="موضوع تعليق Char"/>
-    <w:basedOn w:val="Char5"/>
-    <w:link w:val="af"/>
+  <w:style w:type="character" w:customStyle="1" w:styleId="CommentSubjectChar">
+    <w:name w:val="Comment Subject Char"/>
+    <w:basedOn w:val="CommentTextChar"/>
+    <w:link w:val="CommentSubject"/>
     <w:uiPriority w:val="99"/>
     <w:semiHidden/>
     <w:rsid w:val="005F2DAF"/>
@@ -9575,10 +9927,10 @@
       <w:szCs w:val="20"/>
     </w:rPr>
   </w:style>
-  <w:style w:type="paragraph" w:styleId="af0">
+  <w:style w:type="paragraph" w:styleId="BalloonText">
     <w:name w:val="Balloon Text"/>
-    <w:basedOn w:val="a"/>
-    <w:link w:val="Char7"/>
+    <w:basedOn w:val="Normal"/>
+    <w:link w:val="BalloonTextChar"/>
     <w:uiPriority w:val="99"/>
     <w:semiHidden/>
     <w:unhideWhenUsed/>
@@ -9592,10 +9944,10 @@
       <w:szCs w:val="18"/>
     </w:rPr>
   </w:style>
-  <w:style w:type="character" w:customStyle="1" w:styleId="Char7">
-    <w:name w:val="نص في بالون Char"/>
-    <w:basedOn w:val="a0"/>
-    <w:link w:val="af0"/>
+  <w:style w:type="character" w:customStyle="1" w:styleId="BalloonTextChar">
+    <w:name w:val="Balloon Text Char"/>
+    <w:basedOn w:val="DefaultParagraphFont"/>
+    <w:link w:val="BalloonText"/>
     <w:uiPriority w:val="99"/>
     <w:semiHidden/>
     <w:rsid w:val="005F2DAF"/>
@@ -9605,9 +9957,9 @@
       <w:szCs w:val="18"/>
     </w:rPr>
   </w:style>
-  <w:style w:type="character" w:styleId="af1">
+  <w:style w:type="character" w:styleId="Strong">
     <w:name w:val="Strong"/>
-    <w:basedOn w:val="a0"/>
+    <w:basedOn w:val="DefaultParagraphFont"/>
     <w:uiPriority w:val="22"/>
     <w:qFormat/>
     <w:rsid w:val="005F2DAF"/>
@@ -9616,9 +9968,9 @@
       <w:bCs/>
     </w:rPr>
   </w:style>
-  <w:style w:type="paragraph" w:styleId="af2">
+  <w:style w:type="paragraph" w:styleId="NormalWeb">
     <w:name w:val="Normal (Web)"/>
-    <w:basedOn w:val="a"/>
+    <w:basedOn w:val="Normal"/>
     <w:uiPriority w:val="99"/>
     <w:semiHidden/>
     <w:unhideWhenUsed/>

</xml_diff>